<commit_message>
docs: clarify G1.4 notification controls
</commit_message>
<xml_diff>
--- a/reports/six-goals-functional-tz-2026-07-20/tz-g1-4-for-igor.docx
+++ b/reports/six-goals-functional-tz-2026-07-20/tz-g1-4-for-igor.docx
@@ -1206,17 +1206,6 @@
       </w:r>
     </w:p>
     <w:p>
-      <w:r>
-        <w:rPr>
-          <w:rFonts w:ascii="Calibri" w:hAnsi="Calibri"/>
-          <w:b w:val="0"/>
-          <w:color w:val="17202A"/>
-          <w:sz w:val="22"/>
-        </w:rPr>
-        <w:t>Email используется как дополнительный канал для важных событий, если пользователь отсутствует на сайте либо не увидел событие за установленное время.</w:t>
-      </w:r>
-    </w:p>
-    <w:p>
       <w:pPr>
         <w:keepNext/>
       </w:pPr>
@@ -1227,7 +1216,7 @@
           <w:color w:val="17202A"/>
           <w:sz w:val="22"/>
         </w:rPr>
-        <w:t>Email:</w:t>
+        <w:t>Email используется как дополнительный канал по одному из двух явно заданных правил:</w:t>
       </w:r>
     </w:p>
     <w:p>
@@ -1250,7 +1239,7 @@
           <w:color w:val="17202A"/>
           <w:sz w:val="22"/>
         </w:rPr>
-        <w:t>не заменяет in-app запись;</w:t>
+        <w:t>для критических request/connection/financial/technical событий — после подтвержденного отсутствия пользователя в течение установленного времени;</w:t>
       </w:r>
     </w:p>
     <w:p>
@@ -1273,7 +1262,21 @@
           <w:color w:val="17202A"/>
           <w:sz w:val="22"/>
         </w:rPr>
-        <w:t>использует существующую систему Email Templates;</w:t>
+        <w:t>для нового или уточняющего сообщения — если сообщение остается непрочитанным в течение установленного времени.</w:t>
+      </w:r>
+    </w:p>
+    <w:p>
+      <w:pPr>
+        <w:keepNext/>
+      </w:pPr>
+      <w:r>
+        <w:rPr>
+          <w:rFonts w:ascii="Calibri" w:hAnsi="Calibri"/>
+          <w:b w:val="0"/>
+          <w:color w:val="17202A"/>
+          <w:sz w:val="22"/>
+        </w:rPr>
+        <w:t>Email:</w:t>
       </w:r>
     </w:p>
     <w:p>
@@ -1296,7 +1299,7 @@
           <w:color w:val="17202A"/>
           <w:sz w:val="22"/>
         </w:rPr>
-        <w:t>не содержит полный текст сообщения или кейса;</w:t>
+        <w:t>не заменяет in-app запись;</w:t>
       </w:r>
     </w:p>
     <w:p>
@@ -1319,7 +1322,7 @@
           <w:color w:val="17202A"/>
           <w:sz w:val="22"/>
         </w:rPr>
-        <w:t>не содержит контакты, платежные данные, внутренние причины и служебные идентификаторы;</w:t>
+        <w:t>использует существующую систему Email Templates;</w:t>
       </w:r>
     </w:p>
     <w:p>
@@ -1342,7 +1345,7 @@
           <w:color w:val="17202A"/>
           <w:sz w:val="22"/>
         </w:rPr>
-        <w:t>ведет на авторизованную страницу с актуальным состоянием;</w:t>
+        <w:t>не содержит полный текст сообщения или кейса;</w:t>
       </w:r>
     </w:p>
     <w:p>
@@ -1365,56 +1368,7 @@
           <w:color w:val="17202A"/>
           <w:sz w:val="22"/>
         </w:rPr>
-        <w:t>не обещает компенсацию, пока она фактически не выдана.</w:t>
-      </w:r>
-    </w:p>
-    <w:p>
-      <w:pPr>
-        <w:pStyle w:val="Heading2"/>
-      </w:pPr>
-      <w:r>
-        <w:t>5.4. Следующий этап</w:t>
-      </w:r>
-    </w:p>
-    <w:p>
-      <w:r>
-        <w:rPr>
-          <w:rFonts w:ascii="Calibri" w:hAnsi="Calibri"/>
-          <w:b w:val="0"/>
-          <w:color w:val="17202A"/>
-          <w:sz w:val="22"/>
-        </w:rPr>
-        <w:t>Browser push проектируется позднее. Telegram, SMS и произвольные внешние каналы в G1.4 MVP не входят.</w:t>
-      </w:r>
-    </w:p>
-    <w:p>
-      <w:pPr>
-        <w:pStyle w:val="Heading1"/>
-      </w:pPr>
-      <w:r>
-        <w:t>6. Приоритеты уведомлений</w:t>
-      </w:r>
-    </w:p>
-    <w:p>
-      <w:pPr>
-        <w:pStyle w:val="Heading2"/>
-      </w:pPr>
-      <w:r>
-        <w:t>Обязательные критические</w:t>
-      </w:r>
-    </w:p>
-    <w:p>
-      <w:pPr>
-        <w:keepNext/>
-      </w:pPr>
-      <w:r>
-        <w:rPr>
-          <w:rFonts w:ascii="Calibri" w:hAnsi="Calibri"/>
-          <w:b w:val="0"/>
-          <w:color w:val="17202A"/>
-          <w:sz w:val="22"/>
-        </w:rPr>
-        <w:t>Их нельзя отключить в пользовательских настройках:</w:t>
+        <w:t>не содержит контакты, платежные данные, внутренние причины и служебные идентификаторы;</w:t>
       </w:r>
     </w:p>
     <w:p>
@@ -1437,7 +1391,7 @@
           <w:color w:val="17202A"/>
           <w:sz w:val="22"/>
         </w:rPr>
-        <w:t>фактическое начало paid;</w:t>
+        <w:t>ведет на авторизованную страницу с актуальным состоянием;</w:t>
       </w:r>
     </w:p>
     <w:p>
@@ -1460,7 +1414,56 @@
           <w:color w:val="17202A"/>
           <w:sz w:val="22"/>
         </w:rPr>
-        <w:t>окончание trial перед возможным переходом в paid;</w:t>
+        <w:t>не обещает компенсацию, пока она фактически не выдана.</w:t>
+      </w:r>
+    </w:p>
+    <w:p>
+      <w:pPr>
+        <w:pStyle w:val="Heading2"/>
+      </w:pPr>
+      <w:r>
+        <w:t>5.4. Следующий этап</w:t>
+      </w:r>
+    </w:p>
+    <w:p>
+      <w:r>
+        <w:rPr>
+          <w:rFonts w:ascii="Calibri" w:hAnsi="Calibri"/>
+          <w:b w:val="0"/>
+          <w:color w:val="17202A"/>
+          <w:sz w:val="22"/>
+        </w:rPr>
+        <w:t>Browser push проектируется позднее. Telegram, SMS и произвольные внешние каналы в G1.4 MVP не входят.</w:t>
+      </w:r>
+    </w:p>
+    <w:p>
+      <w:pPr>
+        <w:pStyle w:val="Heading1"/>
+      </w:pPr>
+      <w:r>
+        <w:t>6. Приоритеты уведомлений</w:t>
+      </w:r>
+    </w:p>
+    <w:p>
+      <w:pPr>
+        <w:pStyle w:val="Heading2"/>
+      </w:pPr>
+      <w:r>
+        <w:t>Обязательные критические</w:t>
+      </w:r>
+    </w:p>
+    <w:p>
+      <w:pPr>
+        <w:keepNext/>
+      </w:pPr>
+      <w:r>
+        <w:rPr>
+          <w:rFonts w:ascii="Calibri" w:hAnsi="Calibri"/>
+          <w:b w:val="0"/>
+          <w:color w:val="17202A"/>
+          <w:sz w:val="22"/>
+        </w:rPr>
+        <w:t>Их email нельзя отключить в пользовательских настройках:</w:t>
       </w:r>
     </w:p>
     <w:p>
@@ -1483,7 +1486,7 @@
           <w:color w:val="17202A"/>
           <w:sz w:val="22"/>
         </w:rPr>
-        <w:t>нулевой баланс и начало balance pause;</w:t>
+        <w:t>фактическое начало paid;</w:t>
       </w:r>
     </w:p>
     <w:p>
@@ -1506,7 +1509,7 @@
           <w:color w:val="17202A"/>
           <w:sz w:val="22"/>
         </w:rPr>
-        <w:t>результат пополнения, влияющий на продолжение текущей consultation;</w:t>
+        <w:t>окончание trial перед возможным переходом в paid;</w:t>
       </w:r>
     </w:p>
     <w:p>
@@ -1529,7 +1532,7 @@
           <w:color w:val="17202A"/>
           <w:sz w:val="22"/>
         </w:rPr>
-        <w:t>потеря связи и reconnect timeout во время active paid/pause;</w:t>
+        <w:t>нулевой баланс и начало balance pause;</w:t>
       </w:r>
     </w:p>
     <w:p>
@@ -1552,7 +1555,7 @@
           <w:color w:val="17202A"/>
           <w:sz w:val="22"/>
         </w:rPr>
-        <w:t>technical end;</w:t>
+        <w:t>результат пополнения, влияющий на продолжение текущей consultation;</w:t>
       </w:r>
     </w:p>
     <w:p>
@@ -1575,7 +1578,7 @@
           <w:color w:val="17202A"/>
           <w:sz w:val="22"/>
         </w:rPr>
-        <w:t>подтвержденное нарушение SLA с корректным сообщением клиенту;</w:t>
+        <w:t>потеря связи и reconnect timeout во время active paid/pause;</w:t>
       </w:r>
     </w:p>
     <w:p>
@@ -1598,7 +1601,7 @@
           <w:color w:val="17202A"/>
           <w:sz w:val="22"/>
         </w:rPr>
-        <w:t>критическая ошибка доставки обязательного события;</w:t>
+        <w:t>technical end;</w:t>
       </w:r>
     </w:p>
     <w:p>
@@ -1621,29 +1624,7 @@
           <w:color w:val="17202A"/>
           <w:sz w:val="22"/>
         </w:rPr>
-        <w:t>фактически выданная компенсация или купон.</w:t>
-      </w:r>
-    </w:p>
-    <w:p>
-      <w:pPr>
-        <w:pStyle w:val="Heading2"/>
-      </w:pPr>
-      <w:r>
-        <w:t>Важные</w:t>
-      </w:r>
-    </w:p>
-    <w:p>
-      <w:pPr>
-        <w:keepNext/>
-      </w:pPr>
-      <w:r>
-        <w:rPr>
-          <w:rFonts w:ascii="Calibri" w:hAnsi="Calibri"/>
-          <w:b w:val="0"/>
-          <w:color w:val="17202A"/>
-          <w:sz w:val="22"/>
-        </w:rPr>
-        <w:t>In-app обязателен, email зависит от присутствия и пользовательской настройки:</w:t>
+        <w:t>подтвержденное нарушение SLA с корректным сообщением клиенту;</w:t>
       </w:r>
     </w:p>
     <w:p>
@@ -1666,7 +1647,7 @@
           <w:color w:val="17202A"/>
           <w:sz w:val="22"/>
         </w:rPr>
-        <w:t>новый запрос клиента;</w:t>
+        <w:t>критическая ошибка доставки обязательного события;</w:t>
       </w:r>
     </w:p>
     <w:p>
@@ -1689,7 +1670,29 @@
           <w:color w:val="17202A"/>
           <w:sz w:val="22"/>
         </w:rPr>
-        <w:t>уточняющий вопрос Эксперта;</w:t>
+        <w:t>фактически выданная компенсация или купон.</w:t>
+      </w:r>
+    </w:p>
+    <w:p>
+      <w:pPr>
+        <w:pStyle w:val="Heading2"/>
+      </w:pPr>
+      <w:r>
+        <w:t>Важные</w:t>
+      </w:r>
+    </w:p>
+    <w:p>
+      <w:pPr>
+        <w:keepNext/>
+      </w:pPr>
+      <w:r>
+        <w:rPr>
+          <w:rFonts w:ascii="Calibri" w:hAnsi="Calibri"/>
+          <w:b w:val="0"/>
+          <w:color w:val="17202A"/>
+          <w:sz w:val="22"/>
+        </w:rPr>
+        <w:t>In-app обязателен. Email зависит от правила события, присутствия/прочтения и пользовательской настройки, если email помечен как необязательный:</w:t>
       </w:r>
     </w:p>
     <w:p>
@@ -1712,7 +1715,7 @@
           <w:color w:val="17202A"/>
           <w:sz w:val="22"/>
         </w:rPr>
-        <w:t>принятие, отклонение или истечение запроса;</w:t>
+        <w:t>новый запрос клиента;</w:t>
       </w:r>
     </w:p>
     <w:p>
@@ -1735,7 +1738,7 @@
           <w:color w:val="17202A"/>
           <w:sz w:val="22"/>
         </w:rPr>
-        <w:t>предложение Эксперта начать consultation;</w:t>
+        <w:t>уточняющий вопрос Эксперта;</w:t>
       </w:r>
     </w:p>
     <w:p>
@@ -1758,7 +1761,7 @@
           <w:color w:val="17202A"/>
           <w:sz w:val="22"/>
         </w:rPr>
-        <w:t>готовность к подключению;</w:t>
+        <w:t>принятие, отклонение или истечение запроса;</w:t>
       </w:r>
     </w:p>
     <w:p>
@@ -1781,7 +1784,7 @@
           <w:color w:val="17202A"/>
           <w:sz w:val="22"/>
         </w:rPr>
-        <w:t>low balance;</w:t>
+        <w:t>предложение Эксперта начать consultation;</w:t>
       </w:r>
     </w:p>
     <w:p>
@@ -1804,7 +1807,7 @@
           <w:color w:val="17202A"/>
           <w:sz w:val="22"/>
         </w:rPr>
-        <w:t>возобновление после pause/reconnect;</w:t>
+        <w:t>готовность к подключению;</w:t>
       </w:r>
     </w:p>
     <w:p>
@@ -1827,7 +1830,7 @@
           <w:color w:val="17202A"/>
           <w:sz w:val="22"/>
         </w:rPr>
-        <w:t>завершение consultation;</w:t>
+        <w:t>low balance;</w:t>
       </w:r>
     </w:p>
     <w:p>
@@ -1850,6 +1853,52 @@
           <w:color w:val="17202A"/>
           <w:sz w:val="22"/>
         </w:rPr>
+        <w:t>возобновление после pause/reconnect;</w:t>
+      </w:r>
+    </w:p>
+    <w:p>
+      <w:pPr>
+        <w:spacing w:after="80" w:line="300" w:lineRule="exact"/>
+        <w:ind w:left="605" w:hanging="374"/>
+      </w:pPr>
+      <w:r>
+        <w:rPr>
+          <w:rFonts w:ascii="Calibri" w:hAnsi="Calibri"/>
+          <w:color w:val="17202A"/>
+          <w:sz w:val="22"/>
+        </w:rPr>
+        <w:t xml:space="preserve">•  </w:t>
+      </w:r>
+      <w:r>
+        <w:rPr>
+          <w:rFonts w:ascii="Calibri" w:hAnsi="Calibri"/>
+          <w:b w:val="0"/>
+          <w:color w:val="17202A"/>
+          <w:sz w:val="22"/>
+        </w:rPr>
+        <w:t>завершение consultation;</w:t>
+      </w:r>
+    </w:p>
+    <w:p>
+      <w:pPr>
+        <w:spacing w:after="80" w:line="300" w:lineRule="exact"/>
+        <w:ind w:left="605" w:hanging="374"/>
+      </w:pPr>
+      <w:r>
+        <w:rPr>
+          <w:rFonts w:ascii="Calibri" w:hAnsi="Calibri"/>
+          <w:color w:val="17202A"/>
+          <w:sz w:val="22"/>
+        </w:rPr>
+        <w:t xml:space="preserve">•  </w:t>
+      </w:r>
+      <w:r>
+        <w:rPr>
+          <w:rFonts w:ascii="Calibri" w:hAnsi="Calibri"/>
+          <w:b w:val="0"/>
+          <w:color w:val="17202A"/>
+          <w:sz w:val="22"/>
+        </w:rPr>
         <w:t>новое сообщение в активной consultation.</w:t>
       </w:r>
     </w:p>
@@ -1872,7 +1921,7 @@
           <w:color w:val="17202A"/>
           <w:sz w:val="22"/>
         </w:rPr>
-        <w:t>In-app и бейдж используются по необходимости, email можно отключить:</w:t>
+        <w:t>In-app обязателен для каждого каталогизированного события. Существующий chat badge используется только для событий сообщений; email можно отключить:</w:t>
       </w:r>
     </w:p>
     <w:p>
@@ -3854,7 +3903,62 @@
                 <w:color w:val="17202A"/>
                 <w:sz w:val="20"/>
               </w:rPr>
-              <w:t>Задержка email о непрочитанном важном сообщении</w:t>
+              <w:t>Задержка email по критическому request/connection/financial/technical событию при подтвержденном отсутствии</w:t>
+            </w:r>
+          </w:p>
+        </w:tc>
+        <w:tc>
+          <w:tcPr>
+            <w:tcW w:type="dxa" w:w="2860"/>
+            <w:vAlign w:val="center"/>
+            <w:tcMar>
+              <w:top w:w="100" w:type="dxa"/>
+              <w:bottom w:w="100" w:type="dxa"/>
+              <w:start w:w="140" w:type="dxa"/>
+              <w:end w:w="140" w:type="dxa"/>
+            </w:tcMar>
+          </w:tcPr>
+          <w:p>
+            <w:pPr>
+              <w:spacing w:after="0"/>
+            </w:pPr>
+            <w:r>
+              <w:rPr>
+                <w:rFonts w:ascii="Calibri" w:hAnsi="Calibri"/>
+                <w:b w:val="0"/>
+                <w:color w:val="17202A"/>
+                <w:sz w:val="20"/>
+              </w:rPr>
+              <w:t>1 минута</w:t>
+            </w:r>
+          </w:p>
+        </w:tc>
+      </w:tr>
+      <w:tr>
+        <w:trPr/>
+        <w:tc>
+          <w:tcPr>
+            <w:tcW w:type="dxa" w:w="6500"/>
+            <w:vAlign w:val="center"/>
+            <w:tcMar>
+              <w:top w:w="100" w:type="dxa"/>
+              <w:bottom w:w="100" w:type="dxa"/>
+              <w:start w:w="140" w:type="dxa"/>
+              <w:end w:w="140" w:type="dxa"/>
+            </w:tcMar>
+          </w:tcPr>
+          <w:p>
+            <w:pPr>
+              <w:spacing w:after="0"/>
+            </w:pPr>
+            <w:r>
+              <w:rPr>
+                <w:rFonts w:ascii="Calibri" w:hAnsi="Calibri"/>
+                <w:b w:val="0"/>
+                <w:color w:val="17202A"/>
+                <w:sz w:val="20"/>
+              </w:rPr>
+              <w:t>Задержка email о новом или уточняющем сообщении, если оно не прочитано</w:t>
             </w:r>
           </w:p>
         </w:tc>
@@ -4130,7 +4234,7 @@
           <w:color w:val="17202A"/>
           <w:sz w:val="22"/>
         </w:rPr>
-        <w:t>Присутствие определяется фактической активностью пользователя и подтвержденным просмотром события, а не только открытой когда-то вкладкой. Точный технический способ определяет Игорь.</w:t>
+        <w:t>Присутствие определяется фактической активностью пользователя, а не только открытой когда-то вкладкой. Для критического события система ждет полную 1 минуту подтвержденного отсутствия и затем один раз планирует email. Для нового или уточняющего сообщения система ждет 5 минут непрочитанного состояния; если сообщение прочитано раньше, email не отправляется. Если к событию применимы оба правила, используется критическое правило. Точный серверный способ определения присутствия и прочтения выбирает Игорь.</w:t>
       </w:r>
     </w:p>
     <w:p>
@@ -4537,6 +4641,35 @@
       </w:r>
     </w:p>
     <w:p>
+      <w:r>
+        <w:rPr>
+          <w:rFonts w:ascii="Calibri" w:hAnsi="Calibri"/>
+          <w:b w:val="0"/>
+          <w:color w:val="17202A"/>
+          <w:sz w:val="22"/>
+        </w:rPr>
+        <w:t xml:space="preserve">Пользовательские переключатели управляют </w:t>
+      </w:r>
+      <w:r>
+        <w:rPr>
+          <w:rFonts w:ascii="Calibri" w:hAnsi="Calibri"/>
+          <w:b/>
+          <w:color w:val="17202A"/>
+          <w:sz w:val="22"/>
+        </w:rPr>
+        <w:t>только email</w:t>
+      </w:r>
+      <w:r>
+        <w:rPr>
+          <w:rFonts w:ascii="Calibri" w:hAnsi="Calibri"/>
+          <w:b w:val="0"/>
+          <w:color w:val="17202A"/>
+          <w:sz w:val="22"/>
+        </w:rPr>
+        <w:t>. Термин «необязательное уведомление» в G1.4 означает только необязательный email. Все каталогизированные in-app уведомления внутри сайта обязательны, не имеют пользовательского переключателя и не могут быть отключены пользователем.</w:t>
+      </w:r>
+    </w:p>
+    <w:p>
       <w:pPr>
         <w:keepNext/>
       </w:pPr>
@@ -4699,7 +4832,7 @@
           <w:color w:val="17202A"/>
           <w:sz w:val="22"/>
         </w:rPr>
-        <w:t>in-app историю консультационных событий;</w:t>
+        <w:t>любое in-app уведомление внутри сайта;</w:t>
       </w:r>
     </w:p>
     <w:p>
@@ -6008,7 +6141,7 @@
           <w:color w:val="17202A"/>
           <w:sz w:val="22"/>
         </w:rPr>
-        <w:t>Критическое базовое in-app событие нельзя случайно полностью отключить. Для опасного изменения требуется подтверждение с описанием последствий.</w:t>
+        <w:t>Пользовательские настройки никогда не управляют in-app каналом. Критическое базовое in-app событие нельзя случайно полностью отключить на административном уровне. Для опасного изменения требуется подтверждение с описанием последствий.</w:t>
       </w:r>
     </w:p>
     <w:p>
@@ -7134,7 +7267,7 @@
           <w:color w:val="17202A"/>
           <w:sz w:val="22"/>
         </w:rPr>
-        <w:t>Важное непрочитанное событие через 5 минут создает один email, если это разрешено.</w:t>
+        <w:t>Новое или уточняющее сообщение, непрочитанное 5 минут, создает один email, если это разрешено.</w:t>
       </w:r>
     </w:p>
     <w:p>
@@ -7157,7 +7290,7 @@
           <w:color w:val="17202A"/>
           <w:sz w:val="22"/>
         </w:rPr>
-        <w:t>Критическое событие доставляется независимо от тихих часов.</w:t>
+        <w:t>Критическое request/connection/financial/technical событие через 1 минуту подтвержденного отсутствия создает один email и не задерживается тихими часами.</w:t>
       </w:r>
     </w:p>
     <w:p>
@@ -7249,7 +7382,7 @@
           <w:color w:val="17202A"/>
           <w:sz w:val="22"/>
         </w:rPr>
-        <w:t>Optional email выключается на пользовательской странице.</w:t>
+        <w:t>Optional email выключается на пользовательской странице; этот переключатель не влияет на in-app.</w:t>
       </w:r>
     </w:p>
     <w:p>
@@ -7272,7 +7405,7 @@
           <w:color w:val="17202A"/>
           <w:sz w:val="22"/>
         </w:rPr>
-        <w:t>Обязательный in-app и критический email нельзя выключить пользователю.</w:t>
+        <w:t>Любое in-app уведомление и обязательный критический email нельзя выключить пользователю.</w:t>
       </w:r>
     </w:p>
     <w:p>
@@ -8599,7 +8732,7 @@
         <w:color w:val="5F6B7A"/>
         <w:sz w:val="18"/>
       </w:rPr>
-      <w:t xml:space="preserve">G1.4  •  стр. </w:t>
+      <w:t xml:space="preserve">G1.4 «Уведомления консультации»  •  стр. </w:t>
     </w:r>
     <w:r>
       <w:rPr>

</xml_diff>